<commit_message>
Terms: 48-hour boarding / 24-hour grooming cancellation notice
Co-Authored-By: Claude Opus 5.5 <noreply@anthropic.com>
Claude-Session: https://claude.ai/code/session_01UvstzJAZPbp2Wf3zcn662S
</commit_message>
<xml_diff>
--- a/HDDR-documents/HDDR-Terms-and-Conditions.docx
+++ b/HDDR-documents/HDDR-Terms-and-Conditions.docx
@@ -257,7 +257,7 @@
         <w:spacing w:after="60"/>
       </w:pPr>
       <w:r>
-        <w:t xml:space="preserve">Cancellations or changes must be made at least 24 hours before the scheduled service.</w:t>
+        <w:t xml:space="preserve">Cancellations or changes need at least 48 hours' notice for boarding and 24 hours' notice for grooming and all other services. Holiday reservations may have a longer cancellation window.</w:t>
       </w:r>
     </w:p>
     <w:p>
@@ -351,7 +351,7 @@
         <w:spacing w:after="60"/>
       </w:pPr>
       <w:r>
-        <w:t xml:space="preserve">If you cancel at least 24 hours before the service, any payment for that service is refunded.</w:t>
+        <w:t xml:space="preserve">If you cancel with enough notice (at least 48 hours for boarding, 24 hours for grooming and all other services), any payment for that service is refunded.</w:t>
       </w:r>
     </w:p>
     <w:p>

</xml_diff>